<commit_message>
feat(assets): agregar evidencias de entrenamiento, scripts de extracción y documento de resultados
</commit_message>
<xml_diff>
--- a/00_Planificacion/Plan_de_Trabajo_TC1_IA_Grupo_Segovia_GNN.docx
+++ b/00_Planificacion/Plan_de_Trabajo_TC1_IA_Grupo_Segovia_GNN.docx
@@ -6493,23 +6493,8 @@
         <w:tc>
           <w:tcPr/>
           <w:p>
-            <w:pPr>
-              <w:spacing w:after="0" w:lineRule="auto"/>
-              <w:rPr/>
-            </w:pPr>
-            <w:r>
-              <w:rPr>
-                <w:rFonts w:ascii="Arial" w:cs="Arial" w:eastAsia="Arial" w:hAnsi="Arial"/>
-                <w:sz w:val="20"/>
-                <w:szCs w:val="20"/>
-                <w:rtl w:val="0"/>
-              </w:rPr>
-              <w:t xml:space="preserve">Joshua</w:t>
-            </w:r>
-            <w:r>
-              <w:rPr>
-                <w:rtl w:val="0"/>
-              </w:rPr>
+            <w:r>
+              <w:t>Joshua y Andres</w:t>
             </w:r>
           </w:p>
         </w:tc>
@@ -6591,23 +6576,8 @@
         <w:tc>
           <w:tcPr/>
           <w:p>
-            <w:pPr>
-              <w:spacing w:after="0" w:lineRule="auto"/>
-              <w:rPr/>
-            </w:pPr>
-            <w:r>
-              <w:rPr>
-                <w:rFonts w:ascii="Arial" w:cs="Arial" w:eastAsia="Arial" w:hAnsi="Arial"/>
-                <w:sz w:val="20"/>
-                <w:szCs w:val="20"/>
-                <w:rtl w:val="0"/>
-              </w:rPr>
-              <w:t xml:space="preserve">Capso 1: Disaster Tweets, dataset, metodologia, baseline, modelo y resultados</w:t>
-            </w:r>
-            <w:r>
-              <w:rPr>
-                <w:rtl w:val="0"/>
-              </w:rPr>
+            <w:r>
+              <w:t>Caso 1: Disaster Tweets, dataset, metodologia, baseline, modelo y resultados</w:t>
             </w:r>
           </w:p>
         </w:tc>
@@ -6666,23 +6636,8 @@
         <w:tc>
           <w:tcPr/>
           <w:p>
-            <w:pPr>
-              <w:spacing w:after="0" w:lineRule="auto"/>
-              <w:rPr/>
-            </w:pPr>
-            <w:r>
-              <w:rPr>
-                <w:rFonts w:ascii="Arial" w:cs="Arial" w:eastAsia="Arial" w:hAnsi="Arial"/>
-                <w:sz w:val="20"/>
-                <w:szCs w:val="20"/>
-                <w:rtl w:val="0"/>
-              </w:rPr>
-              <w:t xml:space="preserve">Caso 2: Fake and Real News, dataset, metodologia, baseline, modelo y resultados</w:t>
-            </w:r>
-            <w:r>
-              <w:rPr>
-                <w:rtl w:val="0"/>
-              </w:rPr>
+            <w:r>
+              <w:t>Caso 2: AG News (4 categorias), dataset, metodologia, baseline, modelo y resultados</w:t>
             </w:r>
           </w:p>
         </w:tc>
@@ -6793,23 +6748,8 @@
         <w:tc>
           <w:tcPr/>
           <w:p>
-            <w:pPr>
-              <w:spacing w:after="0" w:lineRule="auto"/>
-              <w:rPr/>
-            </w:pPr>
-            <w:r>
-              <w:rPr>
-                <w:rFonts w:ascii="Arial" w:cs="Arial" w:eastAsia="Arial" w:hAnsi="Arial"/>
-                <w:sz w:val="20"/>
-                <w:szCs w:val="20"/>
-                <w:rtl w:val="0"/>
-              </w:rPr>
-              <w:t xml:space="preserve">Joshua, Jim y Andres</w:t>
-            </w:r>
-            <w:r>
-              <w:rPr>
-                <w:rtl w:val="0"/>
-              </w:rPr>
+            <w:r>
+              <w:t>Joshua</w:t>
             </w:r>
           </w:p>
         </w:tc>

</xml_diff>